<commit_message>
correccion diagrama de contexto
</commit_message>
<xml_diff>
--- a/diagrama contexto, stakeholders y objetivos.docx
+++ b/diagrama contexto, stakeholders y objetivos.docx
@@ -54,17 +54,18 @@
       </w:r>
     </w:p>
     <w:p>
+      <w:pPr>
+        <w:ind w:left="708" w:hanging="708"/>
+      </w:pPr>
       <w:r>
         <w:rPr>
-          <w:b/>
-          <w:bCs/>
           <w:noProof/>
         </w:rPr>
         <w:drawing>
-          <wp:inline distT="0" distB="0" distL="0" distR="0" wp14:anchorId="321B60B6" wp14:editId="6CEB64A4">
-            <wp:extent cx="4915131" cy="3111259"/>
+          <wp:inline distT="0" distB="0" distL="0" distR="0" wp14:anchorId="57626529" wp14:editId="41F83E77">
+            <wp:extent cx="5400040" cy="3032760"/>
             <wp:effectExtent l="0" t="0" r="0" b="0"/>
-            <wp:docPr id="1835587575" name="Imagen 1"/>
+            <wp:docPr id="354649630" name="Imagen 2"/>
             <wp:cNvGraphicFramePr>
               <a:graphicFrameLocks xmlns:a="http://schemas.openxmlformats.org/drawingml/2006/main" noChangeAspect="1"/>
             </wp:cNvGraphicFramePr>
@@ -72,7 +73,7 @@
               <a:graphicData uri="http://schemas.openxmlformats.org/drawingml/2006/picture">
                 <pic:pic xmlns:pic="http://schemas.openxmlformats.org/drawingml/2006/picture">
                   <pic:nvPicPr>
-                    <pic:cNvPr id="1835587575" name="Imagen 1835587575"/>
+                    <pic:cNvPr id="354649630" name="Imagen 354649630"/>
                     <pic:cNvPicPr/>
                   </pic:nvPicPr>
                   <pic:blipFill>
@@ -90,7 +91,7 @@
                   <pic:spPr>
                     <a:xfrm>
                       <a:off x="0" y="0"/>
-                      <a:ext cx="4917860" cy="3112986"/>
+                      <a:ext cx="5400040" cy="3032760"/>
                     </a:xfrm>
                     <a:prstGeom prst="rect">
                       <a:avLst/>

</xml_diff>